<commit_message>
Week 9 assignment: the over-scaffold audit runs on the Before pane
Ten mentions, same shape as Week 8. The prompt section keeps its four questions and
loses the paste mechanics, becoming "What the Planning Partner Checks".

One line was more than a rename. The prompt told students to write "That move is: [name
it]" — a placeholder they filled in by hand every time. The Planner already holds the
move they named, so the line is now "That move is the one you named in the Planner."
The fill-in-the-blank existed only because the tool could not see their work.

63 paragraphs unchanged, validates clean, 3 pages before and after.

Co-Authored-By: Claude Opus 5 (1M context) <noreply@anthropic.com>
</commit_message>
<xml_diff>
--- a/week-9-math-routines/week-9-routine.docx
+++ b/week-9-math-routines/week-9-routine.docx
@@ -555,7 +555,7 @@
           <w:sz w:val="22"/>
           <w:szCs w:val="22"/>
         </w:rPr>
-        <w:t>Then take your stronger routine, your task, and the withheld move to Alkimi, and give it the prompt (after the scoring rubric). Read its over-scaffold audit and follow up.</w:t>
+        <w:t>Then put your stronger routine into the BDA Planner — Plan → Before — and press Check this. It holds the routine beside your task and the move you are withholding (see after the scoring rubric). Read its over-scaffold audit and follow up with Ask me.</w:t>
       </w:r>
     </w:p>
     <w:p>
@@ -591,7 +591,7 @@
           <w:sz w:val="22"/>
           <w:szCs w:val="22"/>
         </w:rPr>
-        <w:t>Choose one routine and revise it (or how you'll pose it) from both reads. In a paragraph, line up all three: the move you named, what your partner(s) surfaced when they ran it, and what Alkimi flagged — and what you changed.</w:t>
+        <w:t>Choose one routine and revise it (or how you'll pose it) from both reads. In a paragraph, line up all three: the move you named, what your partner(s) surfaced when they ran it, and what the planning partner flagged — and what you changed.</w:t>
       </w:r>
     </w:p>
     <w:p>
@@ -697,7 +697,7 @@
           <w:sz w:val="22"/>
           <w:szCs w:val="22"/>
         </w:rPr>
-        <w:t xml:space="preserve"> your two-reads reflection. What your Field Prep Partner(s) surfaced when they ran each routine, then what Alkimi's over-scaffold audit surfaced (in your own words), and how both reads led you to choose and refine one. Human first, then Alkimi.</w:t>
+        <w:t xml:space="preserve"> your two-reads reflection. What your Field Prep Partner(s) surfaced when they ran each routine, then what the over-scaffold audit surfaced (in your own words), and how both reads led you to choose and refine one. Human first, then the machine.</w:t>
       </w:r>
     </w:p>
     <w:p>
@@ -796,7 +796,7 @@
           <w:sz w:val="22"/>
           <w:szCs w:val="22"/>
         </w:rPr>
-        <w:t>Human first: your Field Prep Partner(s) run your routines before Alkimi does. You bring what you learn from them to Alkimi, not the other way around. Both test your design; neither one makes it for you.</w:t>
+        <w:t>Human first: your Field Prep Partner(s) run your routines before the planning partner does. You bring what you learn from them to the Planner, not the other way around. Both test your design; neither one makes it for you.</w:t>
       </w:r>
     </w:p>
     <w:p>
@@ -817,7 +817,7 @@
           <w:sz w:val="22"/>
           <w:szCs w:val="22"/>
         </w:rPr>
-        <w:t>Alkimi is a critic: it pressure-tests whether your routine primes without over-scaffolding, and points at what to fix. It does not design it for you. The design judgment is yours.</w:t>
+        <w:t>The planning partner is a critic: it pressure-tests whether your routine primes without over-scaffolding, and points at what to fix. It does not design it for you. The design judgment is yours.</w:t>
       </w:r>
     </w:p>
     <w:p>
@@ -1360,7 +1360,7 @@
                 <w:sz w:val="21"/>
                 <w:szCs w:val="22"/>
               </w:rPr>
-              <w:t>Evidence you tested with a human first (your partners running your routines), then with Alkimi, and revised critically — not blindly — from both. What you changed, what you rejected, and why. This is Document 2.</w:t>
+              <w:t>Evidence you tested with a human first (your partners running your routines), then with the planning partner, and revised critically — not blindly — from both. What you changed, what you rejected, and why. This is Document 2.</w:t>
             </w:r>
           </w:p>
         </w:tc>
@@ -1389,7 +1389,7 @@
           <w:sz w:val="22"/>
           <w:szCs w:val="22"/>
         </w:rPr>
-        <w:t>The Prompt to Give Alkimi</w:t>
+        <w:t>What the Planning Partner Checks</w:t>
       </w:r>
     </w:p>
     <w:p>
@@ -1406,7 +1406,7 @@
           <w:sz w:val="22"/>
           <w:szCs w:val="22"/>
         </w:rPr>
-        <w:t>Paste your task, your routine, and the one move your task depends on. Then give Alkimi this prompt:</w:t>
+        <w:t>Press Check this on the Before pane. Nothing to paste — it has your task, your routine and the move you named. It does this with them:</w:t>
       </w:r>
     </w:p>
     <w:p>
@@ -1426,7 +1426,7 @@
           <w:sz w:val="22"/>
           <w:szCs w:val="22"/>
         </w:rPr>
-        <w:t>You are a critical friend helping me check a warm-up routine I designed to come before a math task that investigates how students understand a concept. Do not redesign the routine — test the one I give you.</w:t>
+        <w:t>It acts as a critical friend checking a warm-up routine that comes before a task investigating how students understand a concept. It will not redesign your routine — it tests the one you built.</w:t>
       </w:r>
     </w:p>
     <w:p>
@@ -1446,7 +1446,7 @@
           <w:sz w:val="22"/>
           <w:szCs w:val="22"/>
         </w:rPr>
-        <w:t>The routine should warm up the same thinking as the task without handing over the strategy, representation, or procedure the task is meant to reveal. That move is: [name it].</w:t>
+        <w:t>The routine should warm up the same thinking as the task without handing over the strategy, representation, or procedure the task is meant to reveal. That move is the one you named in the Planner.</w:t>
       </w:r>
     </w:p>
     <w:p>
@@ -1466,7 +1466,7 @@
           <w:sz w:val="22"/>
           <w:szCs w:val="22"/>
         </w:rPr>
-        <w:t>Answer plainly and honestly:</w:t>
+        <w:t>It answers plainly:</w:t>
       </w:r>
     </w:p>
     <w:p>
@@ -1566,7 +1566,7 @@
           <w:sz w:val="22"/>
           <w:szCs w:val="22"/>
         </w:rPr>
-        <w:t>If the routine hands over the task's move, say so plainly.</w:t>
+        <w:t>If your routine hands over the task's move, it will say so plainly.</w:t>
       </w:r>
     </w:p>
     <w:sectPr>

</xml_diff>

<commit_message>
Week 9 Day 1: one routine, typed into the Planner, a classmate first, then the genAI
The share-out and the second routine are gone. The Math Routine handout
becomes one page: original and revised routine on top, a reflection below
that includes how the routine avoids giving away the move. Slide 2 says why
the task comes before the routines.

Co-Authored-By: Claude Opus 5.5 <noreply@anthropic.com>
</commit_message>
<xml_diff>
--- a/week-9-math-routines/week-9-routine.docx
+++ b/week-9-math-routines/week-9-routine.docx
@@ -402,7 +402,7 @@
           <w:sz w:val="22"/>
           <w:szCs w:val="22"/>
         </w:rPr>
-        <w:t>Your two routines begin in class. This assignment is where you test them, choose one, finish it, and submit.</w:t>
+        <w:t>Your routine begins in class. This assignment is where you test it, refine it, and submit.</w:t>
       </w:r>
     </w:p>
     <w:p>
@@ -467,7 +467,7 @@
           <w:sz w:val="22"/>
           <w:szCs w:val="22"/>
         </w:rPr>
-        <w:t>Build two short routines for your rich task, as slides (1–2 slides each: Google Slides, PowerPoint, or PDF). Each warms up the same mathematics your task investigates without handing that move over. The routines library is a good place to look.</w:t>
+        <w:t>Type one short routine for your rich task into the BDA Planner (Plan → Before). It warms up the same mathematics your task investigates without handing that move over. The routines library is a good place to look.</w:t>
       </w:r>
     </w:p>
     <w:p>
@@ -486,7 +486,7 @@
           <w:sz w:val="22"/>
           <w:szCs w:val="22"/>
         </w:rPr>
-        <w:t>Clinic</w:t>
+        <w:t>Try it</w:t>
       </w:r>
     </w:p>
     <w:p>
@@ -509,7 +509,7 @@
           <w:sz w:val="22"/>
           <w:szCs w:val="22"/>
         </w:rPr>
-        <w:t>Share your task with your Routine Tester(s) and name the move it depends on, so they know what to watch for.</w:t>
+        <w:t>Share your task with a classmate and name the move it depends on, so they know what to watch for.</w:t>
       </w:r>
     </w:p>
     <w:p>
@@ -532,7 +532,7 @@
           <w:sz w:val="22"/>
           <w:szCs w:val="22"/>
         </w:rPr>
-        <w:t>Have them do each of your two routines — pose each and let them work it. Watch three things: is it well-posed, does it surface entry thinking that surprises you, and does it hand over the move? Ask which routine aligns better with your task and stays clear of the give-away. Capture their feedback.</w:t>
+        <w:t>Show them your routine. Ask three things: is it well-posed, does it surface entry thinking, and does it give the move away? Capture their feedback.</w:t>
       </w:r>
     </w:p>
     <w:p>
@@ -555,7 +555,7 @@
           <w:sz w:val="22"/>
           <w:szCs w:val="22"/>
         </w:rPr>
-        <w:t>Then put your stronger routine into the BDA Planner — Plan → Before — and press Check this. It holds the routine beside your task and the move you are withholding (see after the scoring rubric). Read its over-scaffold audit and follow up with Ask me.</w:t>
+        <w:t>Then press Check this on your Before in the BDA Planner. It holds the routine beside your task and the move you are withholding (see after the scoring rubric). Read its over-scaffold audit and follow up with Ask me. If you run out of time in class, do this at home.</w:t>
       </w:r>
     </w:p>
     <w:p>
@@ -591,7 +591,7 @@
           <w:sz w:val="22"/>
           <w:szCs w:val="22"/>
         </w:rPr>
-        <w:t>Choose one routine and revise it (or how you'll pose it) from both reads. In a paragraph, line up all three: the move you named, what your Routine Tester(s) surfaced when they ran it, and what the genAI planning partner flagged — and what you changed.</w:t>
+        <w:t>Revise your routine (or how you'll pose it) from both reads: your classmate's feedback and the genAI planning partner's check. Then write your one page.</w:t>
       </w:r>
     </w:p>
     <w:p>
@@ -627,7 +627,7 @@
           <w:sz w:val="22"/>
           <w:szCs w:val="22"/>
         </w:rPr>
-        <w:t>One document in two parts, submitted in Canvas as a single PDF. Create your own PDF in Word or Google Docs.</w:t>
+        <w:t>One page, submitted in Canvas as a single PDF. Create your own PDF in Word or Google Docs.</w:t>
       </w:r>
     </w:p>
     <w:p>
@@ -652,7 +652,7 @@
           <w:sz w:val="22"/>
           <w:szCs w:val="22"/>
         </w:rPr>
-        <w:t>Part 1:</w:t>
+        <w:t>Top:</w:t>
       </w:r>
       <w:r>
         <w:rPr>
@@ -662,7 +662,7 @@
           <w:sz w:val="22"/>
           <w:szCs w:val="22"/>
         </w:rPr>
-        <w:t xml:space="preserve"> your routines. Your task, the one move it depends on, your two candidate routines (slides), and the one you chose and refined (with any images).</w:t>
+        <w:t xml:space="preserve"> your routine. Your task and the one move it depends on. Your original routine, then your revised one: what it is and how you'd pose it.</w:t>
       </w:r>
     </w:p>
     <w:p>
@@ -687,7 +687,7 @@
           <w:sz w:val="22"/>
           <w:szCs w:val="22"/>
         </w:rPr>
-        <w:t>Part 2:</w:t>
+        <w:t>Bottom:</w:t>
       </w:r>
       <w:r>
         <w:rPr>
@@ -697,7 +697,7 @@
           <w:sz w:val="22"/>
           <w:szCs w:val="22"/>
         </w:rPr>
-        <w:t xml:space="preserve"> your two-reads reflection. What your Routine Tester(s) surfaced when they ran each routine, then what the over-scaffold audit surfaced (in your own words), and how both reads led you to choose and refine one. Human first, then the machine.</w:t>
+        <w:t xml:space="preserve"> your two-reads reflection. The steps you took to keep your routine from giving away the move. Then what your classmate's feedback showed, what the genAI planning partner's check surfaced (in your own words), and what you changed. Human first, then the machine.</w:t>
       </w:r>
     </w:p>
     <w:p>
@@ -775,7 +775,7 @@
           <w:sz w:val="22"/>
           <w:szCs w:val="22"/>
         </w:rPr>
-        <w:t>Your Routine Tester(s) test your routines by running them; they don't help build them.</w:t>
+        <w:t>Your classmate looks at your routine and gives feedback; they don't help build it.</w:t>
       </w:r>
     </w:p>
     <w:p>
@@ -796,7 +796,7 @@
           <w:sz w:val="22"/>
           <w:szCs w:val="22"/>
         </w:rPr>
-        <w:t>Human first: your Routine Tester(s) run your routines before the genAI planning partner does. You bring what you learn from them to the BDA Planner, not the other way around. Both test your design; neither one makes it for you.</w:t>
+        <w:t>Human first: your classmate looks at your routine before the genAI planning partner does. You bring what you learn from them to the BDA Planner, not the other way around. Both test your design; neither one makes it for you.</w:t>
       </w:r>
     </w:p>
     <w:p>
@@ -1360,7 +1360,7 @@
                 <w:sz w:val="21"/>
                 <w:szCs w:val="22"/>
               </w:rPr>
-              <w:t>Evidence you tested with a human first (your partners running your routines), then with the genAI planning partner, and revised critically — not blindly — from both. What you changed, what you rejected, and why. This is Part 2.</w:t>
+              <w:t>Evidence you got feedback from a human first (a classmate), then from the genAI planning partner, and revised critically — not blindly — from both. What you changed, what you rejected, and why. This is the bottom half.</w:t>
             </w:r>
           </w:p>
         </w:tc>

</xml_diff>

<commit_message>
Math Routine guidelines: cut to one page, plain language
Section 2 is now: complete the Before in the BDA Planner, and show a
classmate before pressing Check this (highlighted). Requirements and
rubric points unchanged.

Co-Authored-By: Claude Opus 5.5 <noreply@anthropic.com>
</commit_message>
<xml_diff>
--- a/week-9-math-routines/week-9-routine.docx
+++ b/week-9-math-routines/week-9-routine.docx
@@ -18,7 +18,7 @@
           <w:sz w:val="28"/>
           <w:szCs w:val="22"/>
         </w:rPr>
-        <w:t>Math Routine — Opening Student Thinking</w:t>
+        <w:t>Math Routine: Opening Student Thinking</w:t>
       </w:r>
     </w:p>
     <w:p>
@@ -92,7 +92,7 @@
           <w:sz w:val="22"/>
           <w:szCs w:val="22"/>
         </w:rPr>
-        <w:t>Your rich task is the During of your nested lesson — the main event, where students' understanding becomes visible. Now you design the Before: a short math routine that opens the lesson, warms up the same mathematics, and surfaces students' entry thinking on your concept. That warm-up is the first slice of evidence for your research question.</w:t>
+        <w:t>Your rich task is the During of your lesson. The Before is a short routine that opens it, like a number talk, Which One Doesn’t Belong?, or Notice &amp; Wonder. It should get students thinking about the same math and show you how they already think about it.</w:t>
       </w:r>
     </w:p>
     <w:p>
@@ -117,256 +117,7 @@
           <w:sz w:val="22"/>
           <w:szCs w:val="22"/>
         </w:rPr>
-        <w:t>A routine is brief, low-floor, and discussion-based — a number talk, Which One Doesn't Belong?, Notice &amp; Wonder, Same &amp; Different, an estimation. You lived these routines in Week 3; now you design one.</w:t>
-      </w:r>
-    </w:p>
-    <w:p>
-      <w:pPr>
-        <w:pStyle w:val="Normal"/>
-        <w:spacing w:before="0" w:after="0" w:line="240" w:lineRule="auto"/>
-        <w:jc w:val="start"/>
-      </w:pPr>
-      <w:r/>
-    </w:p>
-    <w:p>
-      <w:pPr>
-        <w:pStyle w:val="Normal"/>
-        <w:spacing w:before="0" w:after="0" w:line="240" w:lineRule="auto"/>
-        <w:jc w:val="start"/>
-      </w:pPr>
-      <w:r>
-        <w:rPr>
-          <w:rFonts w:ascii="Calibri" w:hAnsi="Calibri" w:eastAsia="ＭＳ 明朝" w:cs="Calibri"/>
-          <w:color w:val="1F2933"/>
-          <w:kern w:val="0"/>
-          <w:sz w:val="22"/>
-          <w:szCs w:val="22"/>
-        </w:rPr>
-        <w:t>The one danger is over-scaffolding. A routine that hands students the strategy, representation, or procedure the task is meant to reveal usurps the task — you can no longer tell what students brought and what you gave them. A good Before primes the thinking without giving away the During.</w:t>
-      </w:r>
-    </w:p>
-    <w:p>
-      <w:pPr>
-        <w:pStyle w:val="Normal"/>
-        <w:spacing w:before="0" w:after="0" w:line="240" w:lineRule="auto"/>
-        <w:jc w:val="start"/>
-      </w:pPr>
-      <w:r/>
-    </w:p>
-    <w:p>
-      <w:pPr>
-        <w:pStyle w:val="Normal"/>
-        <w:spacing w:before="0" w:after="0" w:line="240" w:lineRule="auto"/>
-        <w:jc w:val="start"/>
-      </w:pPr>
-      <w:r>
-        <w:rPr>
-          <w:rFonts w:ascii="Calibri" w:hAnsi="Calibri" w:eastAsia="ＭＳ 明朝" w:cs="Calibri"/>
-          <w:color w:val="1F2933"/>
-          <w:kern w:val="0"/>
-          <w:sz w:val="22"/>
-          <w:szCs w:val="22"/>
-        </w:rPr>
-        <w:t>A strong Before has these characteristics:</w:t>
-      </w:r>
-    </w:p>
-    <w:p>
-      <w:pPr>
-        <w:pStyle w:val="ListBullet"/>
-        <w:contextualSpacing/>
-        <w:numPr>
-          <w:ilvl w:val="0"/>
-          <w:numId w:val="1"/>
-        </w:numPr>
-        <w:spacing w:before="0" w:after="0" w:line="240" w:lineRule="auto"/>
-        <w:ind w:left="360" w:hanging="360"/>
-        <w:jc w:val="start"/>
-      </w:pPr>
-      <w:r>
-        <w:rPr>
-          <w:rFonts w:ascii="Calibri" w:hAnsi="Calibri" w:eastAsia="ＭＳ 明朝" w:cs="Calibri"/>
-          <w:b/>
-          <w:bCs/>
-          <w:color w:val="1F2933"/>
-          <w:kern w:val="0"/>
-          <w:sz w:val="22"/>
-          <w:szCs w:val="22"/>
-        </w:rPr>
-        <w:t>Same mathematics.</w:t>
-      </w:r>
-      <w:r>
-        <w:rPr>
-          <w:rFonts w:ascii="Calibri" w:hAnsi="Calibri" w:eastAsia="ＭＳ 明朝" w:cs="Calibri"/>
-          <w:color w:val="1F2933"/>
-          <w:kern w:val="0"/>
-          <w:sz w:val="22"/>
-          <w:szCs w:val="22"/>
-        </w:rPr>
-        <w:t xml:space="preserve"> It warms up the exact concept your research question is about, not a generic warm-up.</w:t>
-      </w:r>
-    </w:p>
-    <w:p>
-      <w:pPr>
-        <w:pStyle w:val="ListBullet"/>
-        <w:contextualSpacing/>
-        <w:numPr>
-          <w:ilvl w:val="0"/>
-          <w:numId w:val="1"/>
-        </w:numPr>
-        <w:spacing w:before="0" w:after="0" w:line="240" w:lineRule="auto"/>
-        <w:ind w:left="360" w:hanging="360"/>
-        <w:jc w:val="start"/>
-      </w:pPr>
-      <w:r>
-        <w:rPr>
-          <w:rFonts w:ascii="Calibri" w:hAnsi="Calibri" w:eastAsia="ＭＳ 明朝" w:cs="Calibri"/>
-          <w:b/>
-          <w:bCs/>
-          <w:color w:val="1F2933"/>
-          <w:kern w:val="0"/>
-          <w:sz w:val="22"/>
-          <w:szCs w:val="22"/>
-        </w:rPr>
-        <w:t>Surfaces entry thinking.</w:t>
-      </w:r>
-      <w:r>
-        <w:rPr>
-          <w:rFonts w:ascii="Calibri" w:hAnsi="Calibri" w:eastAsia="ＭＳ 明朝" w:cs="Calibri"/>
-          <w:color w:val="1F2933"/>
-          <w:kern w:val="0"/>
-          <w:sz w:val="22"/>
-          <w:szCs w:val="22"/>
-        </w:rPr>
-        <w:t xml:space="preserve"> It is designed to reveal how students already think about this concept, before the task.</w:t>
-      </w:r>
-    </w:p>
-    <w:p>
-      <w:pPr>
-        <w:pStyle w:val="ListBullet"/>
-        <w:contextualSpacing/>
-        <w:numPr>
-          <w:ilvl w:val="0"/>
-          <w:numId w:val="1"/>
-        </w:numPr>
-        <w:spacing w:before="0" w:after="0" w:line="240" w:lineRule="auto"/>
-        <w:ind w:left="360" w:hanging="360"/>
-        <w:jc w:val="start"/>
-      </w:pPr>
-      <w:r>
-        <w:rPr>
-          <w:rFonts w:ascii="Calibri" w:hAnsi="Calibri" w:eastAsia="ＭＳ 明朝" w:cs="Calibri"/>
-          <w:b/>
-          <w:bCs/>
-          <w:color w:val="1F2933"/>
-          <w:kern w:val="0"/>
-          <w:sz w:val="22"/>
-          <w:szCs w:val="22"/>
-        </w:rPr>
-        <w:t>Withholds the task's move.</w:t>
-      </w:r>
-      <w:r>
-        <w:rPr>
-          <w:rFonts w:ascii="Calibri" w:hAnsi="Calibri" w:eastAsia="ＭＳ 明朝" w:cs="Calibri"/>
-          <w:color w:val="1F2933"/>
-          <w:kern w:val="0"/>
-          <w:sz w:val="22"/>
-          <w:szCs w:val="22"/>
-        </w:rPr>
-        <w:t xml:space="preserve"> It does not hand over the key strategy, representation, or procedure your task is meant to make visible.</w:t>
-      </w:r>
-    </w:p>
-    <w:p>
-      <w:pPr>
-        <w:pStyle w:val="ListBullet"/>
-        <w:contextualSpacing/>
-        <w:numPr>
-          <w:ilvl w:val="0"/>
-          <w:numId w:val="1"/>
-        </w:numPr>
-        <w:spacing w:before="0" w:after="0" w:line="240" w:lineRule="auto"/>
-        <w:ind w:left="360" w:hanging="360"/>
-        <w:jc w:val="start"/>
-      </w:pPr>
-      <w:r>
-        <w:rPr>
-          <w:rFonts w:ascii="Calibri" w:hAnsi="Calibri" w:eastAsia="ＭＳ 明朝" w:cs="Calibri"/>
-          <w:b/>
-          <w:bCs/>
-          <w:color w:val="1F2933"/>
-          <w:kern w:val="0"/>
-          <w:sz w:val="22"/>
-          <w:szCs w:val="22"/>
-        </w:rPr>
-        <w:t>Low floor, and brief.</w:t>
-      </w:r>
-      <w:r>
-        <w:rPr>
-          <w:rFonts w:ascii="Calibri" w:hAnsi="Calibri" w:eastAsia="ＭＳ 明朝" w:cs="Calibri"/>
-          <w:color w:val="1F2933"/>
-          <w:kern w:val="0"/>
-          <w:sz w:val="22"/>
-          <w:szCs w:val="22"/>
-        </w:rPr>
-        <w:t xml:space="preserve"> Every student can enter; it runs in a few minutes and invites talk, not a worksheet.</w:t>
-      </w:r>
-    </w:p>
-    <w:p>
-      <w:pPr>
-        <w:pStyle w:val="ListBullet"/>
-        <w:contextualSpacing/>
-        <w:numPr>
-          <w:ilvl w:val="0"/>
-          <w:numId w:val="1"/>
-        </w:numPr>
-        <w:spacing w:before="0" w:after="0" w:line="240" w:lineRule="auto"/>
-        <w:ind w:left="360" w:hanging="360"/>
-        <w:jc w:val="start"/>
-      </w:pPr>
-      <w:r>
-        <w:rPr>
-          <w:rFonts w:ascii="Calibri" w:hAnsi="Calibri" w:eastAsia="ＭＳ 明朝" w:cs="Calibri"/>
-          <w:b/>
-          <w:bCs/>
-          <w:color w:val="1F2933"/>
-          <w:kern w:val="0"/>
-          <w:sz w:val="22"/>
-          <w:szCs w:val="22"/>
-        </w:rPr>
-        <w:t>Invites reasoning.</w:t>
-      </w:r>
-      <w:r>
-        <w:rPr>
-          <w:rFonts w:ascii="Calibri" w:hAnsi="Calibri" w:eastAsia="ＭＳ 明朝" w:cs="Calibri"/>
-          <w:color w:val="1F2933"/>
-          <w:kern w:val="0"/>
-          <w:sz w:val="22"/>
-          <w:szCs w:val="22"/>
-        </w:rPr>
-        <w:t xml:space="preserve"> It asks “how do you know?”, so thinking becomes visible and hearable.</w:t>
-      </w:r>
-    </w:p>
-    <w:p>
-      <w:pPr>
-        <w:pStyle w:val="Normal"/>
-        <w:spacing w:before="0" w:after="0" w:line="240" w:lineRule="auto"/>
-        <w:jc w:val="start"/>
-      </w:pPr>
-    </w:p>
-    <w:p>
-      <w:pPr>
-        <w:pStyle w:val="Normal"/>
-        <w:spacing w:before="0" w:after="0" w:line="240" w:lineRule="auto"/>
-        <w:jc w:val="start"/>
-      </w:pPr>
-      <w:r>
-        <w:rPr>
-          <w:rFonts w:ascii="Calibri" w:hAnsi="Calibri" w:eastAsia="ＭＳ 明朝" w:cs="Calibri"/>
-          <w:color w:val="1F2933"/>
-          <w:kern w:val="0"/>
-          <w:sz w:val="22"/>
-          <w:szCs w:val="22"/>
-        </w:rPr>
-        <w:t>The test of a good Before: after the routine, could a student still show you something genuinely their own on the task — or did the routine already do the task's work? If it gives away the During, it is over-scaffolded. Redesign it.</w:t>
+        <w:t>Don’t give the task away. If the routine hands students the strategy your task is supposed to draw out, you won’t know what they came in with. Here’s the test: after the routine, could a student still show you something of their own on the task? If not, redesign it.</w:t>
       </w:r>
     </w:p>
     <w:p>
@@ -402,7 +153,7 @@
           <w:sz w:val="22"/>
           <w:szCs w:val="22"/>
         </w:rPr>
-        <w:t>Your routine begins in class. This assignment is where you test it, refine it, and submit.</w:t>
+        <w:t>Complete the Before in the BDA Planner.</w:t>
       </w:r>
     </w:p>
     <w:p>
@@ -420,178 +171,9 @@
           <w:kern w:val="0"/>
           <w:sz w:val="22"/>
           <w:szCs w:val="22"/>
+          <w:highlight w:val="yellow"/>
         </w:rPr>
-        <w:t>Studio</w:t>
-      </w:r>
-    </w:p>
-    <w:p>
-      <w:pPr>
-        <w:pStyle w:val="ListNumber"/>
-        <w:contextualSpacing/>
-        <w:numPr>
-          <w:ilvl w:val="0"/>
-          <w:numId w:val="4"/>
-        </w:numPr>
-        <w:spacing w:before="0" w:after="0" w:line="240" w:lineRule="auto"/>
-        <w:ind w:left="360" w:hanging="360"/>
-        <w:jc w:val="start"/>
-      </w:pPr>
-      <w:r>
-        <w:rPr>
-          <w:rFonts w:ascii="Calibri" w:hAnsi="Calibri" w:eastAsia="ＭＳ 明朝" w:cs="Calibri"/>
-          <w:color w:val="1F2933"/>
-          <w:kern w:val="0"/>
-          <w:sz w:val="22"/>
-          <w:szCs w:val="22"/>
-        </w:rPr>
-        <w:t>Name the one move your task depends on — the strategy, representation, or procedure the task exists to make visible.</w:t>
-      </w:r>
-    </w:p>
-    <w:p>
-      <w:pPr>
-        <w:pStyle w:val="ListNumber"/>
-        <w:contextualSpacing/>
-        <w:numPr>
-          <w:ilvl w:val="0"/>
-          <w:numId w:val="4"/>
-        </w:numPr>
-        <w:spacing w:before="0" w:after="0" w:line="240" w:lineRule="auto"/>
-        <w:ind w:left="360" w:hanging="360"/>
-        <w:jc w:val="start"/>
-      </w:pPr>
-      <w:r>
-        <w:rPr>
-          <w:rFonts w:ascii="Calibri" w:hAnsi="Calibri" w:eastAsia="ＭＳ 明朝" w:cs="Calibri"/>
-          <w:color w:val="1F2933"/>
-          <w:kern w:val="0"/>
-          <w:sz w:val="22"/>
-          <w:szCs w:val="22"/>
-        </w:rPr>
-        <w:t>Type one short routine for your rich task into the BDA Planner (Plan → Before). It warms up the same mathematics your task investigates without handing that move over. The routines library is a good place to look.</w:t>
-      </w:r>
-    </w:p>
-    <w:p>
-      <w:pPr>
-        <w:pStyle w:val="Normal"/>
-        <w:spacing w:before="120" w:after="0" w:line="240" w:lineRule="auto"/>
-        <w:jc w:val="start"/>
-      </w:pPr>
-      <w:r>
-        <w:rPr>
-          <w:rFonts w:ascii="Calibri" w:hAnsi="Calibri" w:eastAsia="ＭＳ 明朝" w:cs="Calibri"/>
-          <w:b/>
-          <w:bCs/>
-          <w:color w:val="1F2933"/>
-          <w:kern w:val="0"/>
-          <w:sz w:val="22"/>
-          <w:szCs w:val="22"/>
-        </w:rPr>
-        <w:t>Try it</w:t>
-      </w:r>
-    </w:p>
-    <w:p>
-      <w:pPr>
-        <w:pStyle w:val="ListNumber"/>
-        <w:contextualSpacing/>
-        <w:numPr>
-          <w:ilvl w:val="0"/>
-          <w:numId w:val="4"/>
-        </w:numPr>
-        <w:spacing w:before="0" w:after="0" w:line="240" w:lineRule="auto"/>
-        <w:ind w:left="360" w:hanging="360"/>
-        <w:jc w:val="start"/>
-      </w:pPr>
-      <w:r>
-        <w:rPr>
-          <w:rFonts w:ascii="Calibri" w:hAnsi="Calibri" w:eastAsia="ＭＳ 明朝" w:cs="Calibri"/>
-          <w:color w:val="1F2933"/>
-          <w:kern w:val="0"/>
-          <w:sz w:val="22"/>
-          <w:szCs w:val="22"/>
-        </w:rPr>
-        <w:t>Share your task with a classmate and name the move it depends on, so they know what to watch for.</w:t>
-      </w:r>
-    </w:p>
-    <w:p>
-      <w:pPr>
-        <w:pStyle w:val="ListNumber"/>
-        <w:contextualSpacing/>
-        <w:numPr>
-          <w:ilvl w:val="0"/>
-          <w:numId w:val="4"/>
-        </w:numPr>
-        <w:spacing w:before="0" w:after="0" w:line="240" w:lineRule="auto"/>
-        <w:ind w:left="360" w:hanging="360"/>
-        <w:jc w:val="start"/>
-      </w:pPr>
-      <w:r>
-        <w:rPr>
-          <w:rFonts w:ascii="Calibri" w:hAnsi="Calibri" w:eastAsia="ＭＳ 明朝" w:cs="Calibri"/>
-          <w:color w:val="1F2933"/>
-          <w:kern w:val="0"/>
-          <w:sz w:val="22"/>
-          <w:szCs w:val="22"/>
-        </w:rPr>
-        <w:t>Show them your routine. Ask three things: is it well-posed, does it surface entry thinking, and does it give the move away? Capture their feedback.</w:t>
-      </w:r>
-    </w:p>
-    <w:p>
-      <w:pPr>
-        <w:pStyle w:val="ListNumber"/>
-        <w:contextualSpacing/>
-        <w:numPr>
-          <w:ilvl w:val="0"/>
-          <w:numId w:val="4"/>
-        </w:numPr>
-        <w:spacing w:before="0" w:after="0" w:line="240" w:lineRule="auto"/>
-        <w:ind w:left="360" w:hanging="360"/>
-        <w:jc w:val="start"/>
-      </w:pPr>
-      <w:r>
-        <w:rPr>
-          <w:rFonts w:ascii="Calibri" w:hAnsi="Calibri" w:eastAsia="ＭＳ 明朝" w:cs="Calibri"/>
-          <w:color w:val="1F2933"/>
-          <w:kern w:val="0"/>
-          <w:sz w:val="22"/>
-          <w:szCs w:val="22"/>
-        </w:rPr>
-        <w:t>Then press Check this on your Before in the BDA Planner. It holds the routine beside your task and the move you are withholding (see after the scoring rubric). Read its over-scaffold audit and follow up with Ask me. If you run out of time in class, do this at home.</w:t>
-      </w:r>
-    </w:p>
-    <w:p>
-      <w:pPr>
-        <w:pStyle w:val="Normal"/>
-        <w:spacing w:before="120" w:after="0" w:line="240" w:lineRule="auto"/>
-        <w:jc w:val="start"/>
-      </w:pPr>
-      <w:r>
-        <w:rPr>
-          <w:rFonts w:ascii="Calibri" w:hAnsi="Calibri" w:eastAsia="ＭＳ 明朝" w:cs="Calibri"/>
-          <w:b/>
-          <w:bCs/>
-          <w:color w:val="1F2933"/>
-          <w:kern w:val="0"/>
-          <w:sz w:val="22"/>
-          <w:szCs w:val="22"/>
-        </w:rPr>
-        <w:t>Homework</w:t>
-      </w:r>
-    </w:p>
-    <w:p>
-      <w:pPr>
-        <w:pStyle w:val="Normal"/>
-        <w:spacing w:before="0" w:after="0" w:line="240" w:lineRule="auto"/>
-        <w:jc w:val="start"/>
-      </w:pPr>
-      <w:r>
-        <w:rPr>
-          <w:rFonts w:ascii="Calibri" w:hAnsi="Calibri" w:eastAsia="ＭＳ 明朝" w:cs="Calibri"/>
-          <w:color w:val="1F2933"/>
-          <w:kern w:val="0"/>
-          <w:sz w:val="22"/>
-          <w:szCs w:val="22"/>
-        </w:rPr>
-        <w:t>Revise your routine (or how you'll pose it) from both reads: your classmate's feedback and the genAI planning partner's check. Then write your one page.</w:t>
+        <w:t>Show it to a classmate before you press Check this.</w:t>
       </w:r>
     </w:p>
     <w:p>
@@ -627,7 +209,7 @@
           <w:sz w:val="22"/>
           <w:szCs w:val="22"/>
         </w:rPr>
-        <w:t>One page, submitted in Canvas as a single PDF. Create your own PDF in Word or Google Docs.</w:t>
+        <w:t>One page, submitted to Canvas as a PDF.</w:t>
       </w:r>
     </w:p>
     <w:p>
@@ -657,12 +239,13 @@
       <w:r>
         <w:rPr>
           <w:rFonts w:ascii="Calibri" w:hAnsi="Calibri" w:eastAsia="ＭＳ 明朝" w:cs="Calibri"/>
+          <w:bCs/>
           <w:color w:val="1F2933"/>
           <w:kern w:val="0"/>
           <w:sz w:val="22"/>
           <w:szCs w:val="22"/>
         </w:rPr>
-        <w:t xml:space="preserve"> your routine. Your task and the one move it depends on. Your original routine, then your revised one: what it is and how you'd pose it.</w:t>
+        <w:t xml:space="preserve"> your task, the move it depends on, your first routine, and your revised routine.</w:t>
       </w:r>
     </w:p>
     <w:p>
@@ -692,12 +275,13 @@
       <w:r>
         <w:rPr>
           <w:rFonts w:ascii="Calibri" w:hAnsi="Calibri" w:eastAsia="ＭＳ 明朝" w:cs="Calibri"/>
+          <w:bCs/>
           <w:color w:val="1F2933"/>
           <w:kern w:val="0"/>
           <w:sz w:val="22"/>
           <w:szCs w:val="22"/>
         </w:rPr>
-        <w:t xml:space="preserve"> your two-reads reflection. The steps you took to keep your routine from giving away the move. Then what your classmate's feedback showed, what the genAI planning partner's check surfaced (in your own words), and what you changed. Human first, then the machine.</w:t>
+        <w:t xml:space="preserve"> what your classmate said, what Check this said (in your own words), and what you changed.</w:t>
       </w:r>
     </w:p>
     <w:p>
@@ -714,7 +298,7 @@
           <w:sz w:val="22"/>
           <w:szCs w:val="22"/>
         </w:rPr>
-        <w:t>Pseudonym only. No student names or identifying details anywhere (FERPA).</w:t>
+        <w:t>Use pseudonyms only, with no student names (FERPA).</w:t>
       </w:r>
     </w:p>
     <w:p>
@@ -739,10 +323,6 @@
     <w:p>
       <w:pPr>
         <w:pStyle w:val="Normal"/>
-        <w:numPr>
-          <w:ilvl w:val="0"/>
-          <w:numId w:val="1"/>
-        </w:numPr>
         <w:spacing w:before="0" w:after="0" w:line="240" w:lineRule="auto"/>
         <w:jc w:val="start"/>
       </w:pPr>
@@ -754,70 +334,7 @@
           <w:sz w:val="22"/>
           <w:szCs w:val="22"/>
         </w:rPr>
-        <w:t>The routine is yours, paired with your task and aimed at your question. You will workshop routines with classmates and can borrow from the routines library, but the Before you submit and defend is built for your concept and your task. You may teach the same lesson as the classmate you're placed with, but each of you answers your own research question and submits your own work.</w:t>
-      </w:r>
-    </w:p>
-    <w:p>
-      <w:pPr>
-        <w:pStyle w:val="Normal"/>
-        <w:numPr>
-          <w:ilvl w:val="0"/>
-          <w:numId w:val="1"/>
-        </w:numPr>
-        <w:spacing w:before="0" w:after="0" w:line="240" w:lineRule="auto"/>
-        <w:jc w:val="start"/>
-      </w:pPr>
-      <w:r>
-        <w:rPr>
-          <w:rFonts w:ascii="Calibri" w:hAnsi="Calibri" w:eastAsia="ＭＳ 明朝" w:cs="Calibri"/>
-          <w:color w:val="1F2933"/>
-          <w:kern w:val="0"/>
-          <w:sz w:val="22"/>
-          <w:szCs w:val="22"/>
-        </w:rPr>
-        <w:t>Your classmate looks at your routine and gives feedback; they don't help build it.</w:t>
-      </w:r>
-    </w:p>
-    <w:p>
-      <w:pPr>
-        <w:pStyle w:val="Normal"/>
-        <w:numPr>
-          <w:ilvl w:val="0"/>
-          <w:numId w:val="1"/>
-        </w:numPr>
-        <w:spacing w:before="0" w:after="0" w:line="240" w:lineRule="auto"/>
-        <w:jc w:val="start"/>
-      </w:pPr>
-      <w:r>
-        <w:rPr>
-          <w:rFonts w:ascii="Calibri" w:hAnsi="Calibri" w:eastAsia="ＭＳ 明朝" w:cs="Calibri"/>
-          <w:color w:val="1F2933"/>
-          <w:kern w:val="0"/>
-          <w:sz w:val="22"/>
-          <w:szCs w:val="22"/>
-        </w:rPr>
-        <w:t>Human first: your classmate looks at your routine before the genAI planning partner does. You bring what you learn from them to the BDA Planner, not the other way around. Both test your design; neither one makes it for you.</w:t>
-      </w:r>
-    </w:p>
-    <w:p>
-      <w:pPr>
-        <w:pStyle w:val="Normal"/>
-        <w:numPr>
-          <w:ilvl w:val="0"/>
-          <w:numId w:val="1"/>
-        </w:numPr>
-        <w:spacing w:before="0" w:after="0" w:line="240" w:lineRule="auto"/>
-        <w:jc w:val="start"/>
-      </w:pPr>
-      <w:r>
-        <w:rPr>
-          <w:rFonts w:ascii="Calibri" w:hAnsi="Calibri" w:eastAsia="ＭＳ 明朝" w:cs="Calibri"/>
-          <w:color w:val="1F2933"/>
-          <w:kern w:val="0"/>
-          <w:sz w:val="22"/>
-          <w:szCs w:val="22"/>
-        </w:rPr>
-        <w:t>The genAI planning partner is a critic: it pressure-tests whether your routine primes without over-scaffolding, and points at what to fix. It does not design it for you. The design judgment is yours.</w:t>
+        <w:t>Borrow from classmates and the routines library, but submit a routine built for your own task. Get your classmate’s feedback before you press Check this. Neither one writes the routine for you.</w:t>
       </w:r>
     </w:p>
     <w:p>
@@ -1032,7 +549,7 @@
                 <w:sz w:val="21"/>
                 <w:szCs w:val="22"/>
               </w:rPr>
-              <w:t>Warms up the exact concept your research question and task are about — a genuine pairing, not a generic warm-up.</w:t>
+              <w:t>Warms up the concept your task is about.</w:t>
             </w:r>
           </w:p>
         </w:tc>
@@ -1114,7 +631,7 @@
                 <w:sz w:val="21"/>
                 <w:szCs w:val="22"/>
               </w:rPr>
-              <w:t>Designed to reveal how students already think about the concept before the task. Names the entry thinking you expect to see — the first slice of evidence.</w:t>
+              <w:t>Shows how students already think about it, and you say what you expect to see.</w:t>
             </w:r>
           </w:p>
         </w:tc>
@@ -1157,7 +674,7 @@
                 <w:sz w:val="21"/>
                 <w:szCs w:val="22"/>
               </w:rPr>
-              <w:t>Does not over-scaffold (5)</w:t>
+              <w:t>Doesn’t give the task away (5)</w:t>
             </w:r>
           </w:p>
         </w:tc>
@@ -1196,7 +713,7 @@
                 <w:sz w:val="21"/>
                 <w:szCs w:val="22"/>
               </w:rPr>
-              <w:t>Withholds the strategy, representation, or procedure your task is meant to make visible. Primes the thinking without giving away the During. The central test.</w:t>
+              <w:t>Holds back the move your task is meant to reveal.</w:t>
             </w:r>
           </w:p>
         </w:tc>
@@ -1239,7 +756,7 @@
                 <w:sz w:val="21"/>
                 <w:szCs w:val="22"/>
               </w:rPr>
-              <w:t>Well-posed for students (5)</w:t>
+              <w:t>Well-posed (5)</w:t>
             </w:r>
           </w:p>
         </w:tc>
@@ -1278,7 +795,7 @@
                 <w:sz w:val="21"/>
                 <w:szCs w:val="22"/>
               </w:rPr>
-              <w:t>Low floor, brief, and invites reasoning (“how do you know?”). A real entry point for students, not a worksheet.</w:t>
+              <w:t>Every student can start, it’s short, and it asks “how do you know?”</w:t>
             </w:r>
           </w:p>
         </w:tc>
@@ -1360,7 +877,7 @@
                 <w:sz w:val="21"/>
                 <w:szCs w:val="22"/>
               </w:rPr>
-              <w:t>Evidence you got feedback from a human first (a classmate), then from the genAI planning partner, and revised critically — not blindly — from both. What you changed, what you rejected, and why. This is the bottom half.</w:t>
+              <w:t>Feedback from a classmate, then Check this. You say what you changed, what you didn’t, and why.</w:t>
             </w:r>
           </w:p>
         </w:tc>
@@ -1372,202 +889,6 @@
         <w:spacing w:before="120" w:after="0" w:line="240" w:lineRule="auto"/>
         <w:jc w:val="start"/>
       </w:pPr>
-    </w:p>
-    <w:p>
-      <w:pPr>
-        <w:pStyle w:val="Normal"/>
-        <w:spacing w:before="120" w:after="0" w:line="240" w:lineRule="auto"/>
-        <w:jc w:val="start"/>
-      </w:pPr>
-      <w:r>
-        <w:rPr>
-          <w:rFonts w:ascii="Calibri" w:hAnsi="Calibri" w:eastAsia="ＭＳ 明朝" w:cs="Calibri"/>
-          <w:b/>
-          <w:bCs/>
-          <w:color w:val="1F2933"/>
-          <w:kern w:val="0"/>
-          <w:sz w:val="22"/>
-          <w:szCs w:val="22"/>
-        </w:rPr>
-        <w:t>What the genAI Planning Partner Checks</w:t>
-      </w:r>
-    </w:p>
-    <w:p>
-      <w:pPr>
-        <w:pStyle w:val="Normal"/>
-        <w:spacing w:before="0" w:after="0" w:line="240" w:lineRule="auto"/>
-        <w:jc w:val="start"/>
-      </w:pPr>
-      <w:r>
-        <w:rPr>
-          <w:rFonts w:ascii="Calibri" w:hAnsi="Calibri" w:eastAsia="ＭＳ 明朝" w:cs="Calibri"/>
-          <w:color w:val="1F2933"/>
-          <w:kern w:val="0"/>
-          <w:sz w:val="22"/>
-          <w:szCs w:val="22"/>
-        </w:rPr>
-        <w:t>Press Check this on the Before pane. Nothing to paste — it has your task, your routine and the move you named. It does this with them:</w:t>
-      </w:r>
-    </w:p>
-    <w:p>
-      <w:pPr>
-        <w:pStyle w:val="Normal"/>
-        <w:spacing w:before="60" w:after="0" w:line="240" w:lineRule="auto"/>
-        <w:ind w:left="360"/>
-        <w:jc w:val="start"/>
-      </w:pPr>
-      <w:r>
-        <w:rPr>
-          <w:rFonts w:ascii="Calibri" w:hAnsi="Calibri" w:eastAsia="ＭＳ 明朝" w:cs="Calibri"/>
-          <w:i/>
-          <w:iCs/>
-          <w:color w:val="1F2933"/>
-          <w:kern w:val="0"/>
-          <w:sz w:val="22"/>
-          <w:szCs w:val="22"/>
-        </w:rPr>
-        <w:t>It acts as a critical friend checking a warm-up routine that comes before a task investigating how students understand a concept. It will not redesign your routine — it tests the one you built.</w:t>
-      </w:r>
-    </w:p>
-    <w:p>
-      <w:pPr>
-        <w:pStyle w:val="Normal"/>
-        <w:spacing w:before="0" w:after="0" w:line="240" w:lineRule="auto"/>
-        <w:ind w:left="360"/>
-        <w:jc w:val="start"/>
-      </w:pPr>
-      <w:r>
-        <w:rPr>
-          <w:rFonts w:ascii="Calibri" w:hAnsi="Calibri" w:eastAsia="ＭＳ 明朝" w:cs="Calibri"/>
-          <w:i/>
-          <w:iCs/>
-          <w:color w:val="1F2933"/>
-          <w:kern w:val="0"/>
-          <w:sz w:val="22"/>
-          <w:szCs w:val="22"/>
-        </w:rPr>
-        <w:t>The routine should warm up the same thinking as the task without handing over the strategy, representation, or procedure the task is meant to reveal. That move is the one you named in the BDA Planner.</w:t>
-      </w:r>
-    </w:p>
-    <w:p>
-      <w:pPr>
-        <w:pStyle w:val="Normal"/>
-        <w:spacing w:before="0" w:after="0" w:line="240" w:lineRule="auto"/>
-        <w:ind w:left="360"/>
-        <w:jc w:val="start"/>
-      </w:pPr>
-      <w:r>
-        <w:rPr>
-          <w:rFonts w:ascii="Calibri" w:hAnsi="Calibri" w:eastAsia="ＭＳ 明朝" w:cs="Calibri"/>
-          <w:i/>
-          <w:iCs/>
-          <w:color w:val="1F2933"/>
-          <w:kern w:val="0"/>
-          <w:sz w:val="22"/>
-          <w:szCs w:val="22"/>
-        </w:rPr>
-        <w:t>It answers plainly:</w:t>
-      </w:r>
-    </w:p>
-    <w:p>
-      <w:pPr>
-        <w:pStyle w:val="Normal"/>
-        <w:spacing w:before="0" w:after="0" w:line="240" w:lineRule="auto"/>
-        <w:ind w:left="360"/>
-        <w:jc w:val="start"/>
-      </w:pPr>
-      <w:r>
-        <w:rPr>
-          <w:rFonts w:ascii="Calibri" w:hAnsi="Calibri" w:eastAsia="ＭＳ 明朝" w:cs="Calibri"/>
-          <w:i/>
-          <w:iCs/>
-          <w:color w:val="1F2933"/>
-          <w:kern w:val="0"/>
-          <w:sz w:val="22"/>
-          <w:szCs w:val="22"/>
-        </w:rPr>
-        <w:t>1. Holding the routine next to the task, does it give away that move — or any part of it? Point to exactly where.</w:t>
-      </w:r>
-    </w:p>
-    <w:p>
-      <w:pPr>
-        <w:pStyle w:val="Normal"/>
-        <w:spacing w:before="0" w:after="0" w:line="240" w:lineRule="auto"/>
-        <w:ind w:left="360"/>
-        <w:jc w:val="start"/>
-      </w:pPr>
-      <w:r>
-        <w:rPr>
-          <w:rFonts w:ascii="Calibri" w:hAnsi="Calibri" w:eastAsia="ＭＳ 明朝" w:cs="Calibri"/>
-          <w:i/>
-          <w:iCs/>
-          <w:color w:val="1F2933"/>
-          <w:kern w:val="0"/>
-          <w:sz w:val="22"/>
-          <w:szCs w:val="22"/>
-        </w:rPr>
-        <w:t>2. What entry thinking would this routine surface before the task?</w:t>
-      </w:r>
-    </w:p>
-    <w:p>
-      <w:pPr>
-        <w:pStyle w:val="Normal"/>
-        <w:spacing w:before="0" w:after="0" w:line="240" w:lineRule="auto"/>
-        <w:ind w:left="360"/>
-        <w:jc w:val="start"/>
-      </w:pPr>
-      <w:r>
-        <w:rPr>
-          <w:rFonts w:ascii="Calibri" w:hAnsi="Calibri" w:eastAsia="ＭＳ 明朝" w:cs="Calibri"/>
-          <w:i/>
-          <w:iCs/>
-          <w:color w:val="1F2933"/>
-          <w:kern w:val="0"/>
-          <w:sz w:val="22"/>
-          <w:szCs w:val="22"/>
-        </w:rPr>
-        <w:t>3. Where might it over-scaffold — do the task's work for students — and where might it do too little to prime anything?</w:t>
-      </w:r>
-    </w:p>
-    <w:p>
-      <w:pPr>
-        <w:pStyle w:val="Normal"/>
-        <w:spacing w:before="0" w:after="0" w:line="240" w:lineRule="auto"/>
-        <w:ind w:left="360"/>
-        <w:jc w:val="start"/>
-      </w:pPr>
-      <w:r>
-        <w:rPr>
-          <w:rFonts w:ascii="Calibri" w:hAnsi="Calibri" w:eastAsia="ＭＳ 明朝" w:cs="Calibri"/>
-          <w:i/>
-          <w:iCs/>
-          <w:color w:val="1F2933"/>
-          <w:kern w:val="0"/>
-          <w:sz w:val="22"/>
-          <w:szCs w:val="22"/>
-        </w:rPr>
-        <w:t>4. What one or two changes would keep it priming without giving the task away?</w:t>
-      </w:r>
-    </w:p>
-    <w:p>
-      <w:pPr>
-        <w:pStyle w:val="Normal"/>
-        <w:spacing w:before="0" w:after="0" w:line="240" w:lineRule="auto"/>
-        <w:ind w:left="360"/>
-        <w:jc w:val="start"/>
-      </w:pPr>
-      <w:r>
-        <w:rPr>
-          <w:rFonts w:ascii="Calibri" w:hAnsi="Calibri" w:eastAsia="ＭＳ 明朝" w:cs="Calibri"/>
-          <w:i/>
-          <w:iCs/>
-          <w:color w:val="1F2933"/>
-          <w:kern w:val="0"/>
-          <w:sz w:val="22"/>
-          <w:szCs w:val="22"/>
-        </w:rPr>
-        <w:t>If your routine hands over the task's move, it will say so plainly.</w:t>
-      </w:r>
     </w:p>
     <w:sectPr>
       <w:type w:val="nextPage"/>

</xml_diff>